<commit_message>
Add Q2 procurement applications
</commit_message>
<xml_diff>
--- a/applications/2026/Q2/瑞莎CubieA5E数据采集套件/申报书.docx
+++ b/applications/2026/Q2/瑞莎CubieA5E数据采集套件/申报书.docx
@@ -4,56 +4,576 @@
   <w:body>
     <w:p>
       <w:pPr>
-        <w:spacing w:after="80"/>
+        <w:pStyle w:val="Title"/>
         <w:jc w:val="center"/>
       </w:pPr>
       <w:r>
         <w:rPr>
-          <w:rFonts w:ascii="Microsoft YaHei" w:hAnsi="Microsoft YaHei" w:eastAsia="Microsoft YaHei"/>
-          <w:b/>
-          <w:color w:val="1F4E5F"/>
+          <w:rFonts w:ascii="Times New Roman" w:hAnsi="Times New Roman" w:eastAsia="黑体"/>
           <w:sz w:val="36"/>
         </w:rPr>
-        <w:t>双网口数据采集计算终端套件购买/经费需求</w:t>
+        <w:t>双网口数据采集计算终端套件采购</w:t>
       </w:r>
     </w:p>
     <w:p>
       <w:pPr>
-        <w:spacing w:after="240"/>
-        <w:jc w:val="center"/>
+        <w:pStyle w:val="Heading1"/>
       </w:pPr>
       <w:r>
         <w:rPr>
-          <w:rFonts w:ascii="Microsoft YaHei" w:hAnsi="Microsoft YaHei" w:eastAsia="Microsoft YaHei"/>
+          <w:rFonts w:ascii="Times New Roman" w:hAnsi="Times New Roman" w:eastAsia="宋体"/>
           <w:b w:val="0"/>
-          <w:color w:val="555555"/>
-          <w:sz w:val="21"/>
         </w:rPr>
-        <w:t>Radxa Cubie A5E 4GB 商业级计算终端 + PD 30W 电源适配器</w:t>
+        <w:t>一、申报摘要</w:t>
+      </w:r>
+    </w:p>
+    <w:p>
+      <w:r>
+        <w:rPr>
+          <w:rFonts w:ascii="Times New Roman" w:hAnsi="Times New Roman" w:eastAsia="宋体"/>
+          <w:b w:val="0"/>
+        </w:rPr>
+        <w:t>本次拟申报采购：Radxa Cubie A5E 1GB 商业级双网口数据采集计算终端套件。本项目拟购置 Radxa Cubie A5E 1GB 商业级双网口数据采集计算终端及 PD 供电配件。A5E 具备双千兆以太网口、Wi-Fi 6、USB 3.0、40 Pin GPIO 和 M.2 2230 NVMe SSD 扩展能力，可作为雷达与心音、心电同步采集系统中的边缘 Linux 节点。双网口便于将雷达数据网络与实验室局域网或上位机网络隔离，M.2 SSD 适合连续采集时做本地高速缓存，内置 RISC-V MCU 可用于学习实时控制、触发同步和状态监测这一新型异构架构。</w:t>
       </w:r>
     </w:p>
     <w:p>
       <w:pPr>
-        <w:spacing w:after="200"/>
-        <w:ind w:left="227" w:right="227"/>
+        <w:pStyle w:val="Heading1"/>
       </w:pPr>
       <w:r>
         <w:rPr>
-          <w:rFonts w:ascii="Microsoft YaHei" w:hAnsi="Microsoft YaHei" w:eastAsia="Microsoft YaHei"/>
-          <w:sz w:val="21"/>
+          <w:rFonts w:ascii="Times New Roman" w:hAnsi="Times New Roman" w:eastAsia="宋体"/>
+          <w:b w:val="0"/>
         </w:rPr>
-        <w:t>本次申报用于购置一套面向雷达、心音、心电数据采集实验的双网口边缘主控平台。设备重点价值在于双千兆网口、M.2 NVMe 本地高速缓存、USB/GPIO 扩展，以及 Linux 主系统与内置 RISC-V MCU/RTOS 实时控制单元并存的新架构。摄像头模块已从本次预算中移除。当前淘宝桌面版页面显示的 ¥161.99 为 1GB 商业级起售价，不能作为 4GB 商业级预算价；4GB 主板金额需在采购前进入对应规格下单页复核。</w:t>
+        <w:t>二、采购对象与价格</w:t>
+      </w:r>
+    </w:p>
+    <w:tbl>
+      <w:tblPr>
+        <w:tblStyle w:val="TableGrid"/>
+        <w:tblW w:type="auto" w:w="0"/>
+        <w:tblLook w:firstColumn="1" w:firstRow="1" w:lastColumn="0" w:lastRow="0" w:noHBand="0" w:noVBand="1" w:val="04A0"/>
+      </w:tblPr>
+      <w:tblGrid>
+        <w:gridCol w:w="1728"/>
+        <w:gridCol w:w="1728"/>
+        <w:gridCol w:w="1728"/>
+        <w:gridCol w:w="1728"/>
+        <w:gridCol w:w="1728"/>
+      </w:tblGrid>
+      <w:tr>
+        <w:tc>
+          <w:tcPr>
+            <w:tcW w:type="dxa" w:w="1728"/>
+          </w:tcPr>
+          <w:p>
+            <w:r>
+              <w:rPr>
+                <w:rFonts w:ascii="Times New Roman" w:hAnsi="Times New Roman" w:eastAsia="宋体"/>
+                <w:b/>
+              </w:rPr>
+              <w:t>项目</w:t>
+            </w:r>
+          </w:p>
+        </w:tc>
+        <w:tc>
+          <w:tcPr>
+            <w:tcW w:type="dxa" w:w="1728"/>
+          </w:tcPr>
+          <w:p>
+            <w:r>
+              <w:rPr>
+                <w:rFonts w:ascii="Times New Roman" w:hAnsi="Times New Roman" w:eastAsia="宋体"/>
+                <w:b/>
+              </w:rPr>
+              <w:t>数量</w:t>
+            </w:r>
+          </w:p>
+        </w:tc>
+        <w:tc>
+          <w:tcPr>
+            <w:tcW w:type="dxa" w:w="1728"/>
+          </w:tcPr>
+          <w:p>
+            <w:r>
+              <w:rPr>
+                <w:rFonts w:ascii="Times New Roman" w:hAnsi="Times New Roman" w:eastAsia="宋体"/>
+                <w:b/>
+              </w:rPr>
+              <w:t>单价(CNY)</w:t>
+            </w:r>
+          </w:p>
+        </w:tc>
+        <w:tc>
+          <w:tcPr>
+            <w:tcW w:type="dxa" w:w="1728"/>
+          </w:tcPr>
+          <w:p>
+            <w:r>
+              <w:rPr>
+                <w:rFonts w:ascii="Times New Roman" w:hAnsi="Times New Roman" w:eastAsia="宋体"/>
+                <w:b/>
+              </w:rPr>
+              <w:t>小计(CNY)</w:t>
+            </w:r>
+          </w:p>
+        </w:tc>
+        <w:tc>
+          <w:tcPr>
+            <w:tcW w:type="dxa" w:w="1728"/>
+          </w:tcPr>
+          <w:p>
+            <w:r>
+              <w:rPr>
+                <w:rFonts w:ascii="Times New Roman" w:hAnsi="Times New Roman" w:eastAsia="宋体"/>
+                <w:b/>
+              </w:rPr>
+              <w:t>备注</w:t>
+            </w:r>
+          </w:p>
+        </w:tc>
+      </w:tr>
+      <w:tr>
+        <w:tc>
+          <w:tcPr>
+            <w:tcW w:type="dxa" w:w="1728"/>
+          </w:tcPr>
+          <w:p>
+            <w:r>
+              <w:rPr>
+                <w:rFonts w:ascii="Times New Roman" w:hAnsi="Times New Roman" w:eastAsia="宋体"/>
+              </w:rPr>
+              <w:t>Radxa Cubie A5E 1GB 商业级计算终端</w:t>
+            </w:r>
+          </w:p>
+        </w:tc>
+        <w:tc>
+          <w:tcPr>
+            <w:tcW w:type="dxa" w:w="1728"/>
+          </w:tcPr>
+          <w:p>
+            <w:r>
+              <w:rPr>
+                <w:rFonts w:ascii="Times New Roman" w:hAnsi="Times New Roman" w:eastAsia="宋体"/>
+              </w:rPr>
+              <w:t>1</w:t>
+            </w:r>
+          </w:p>
+        </w:tc>
+        <w:tc>
+          <w:tcPr>
+            <w:tcW w:type="dxa" w:w="1728"/>
+          </w:tcPr>
+          <w:p>
+            <w:r>
+              <w:rPr>
+                <w:rFonts w:ascii="Times New Roman" w:hAnsi="Times New Roman" w:eastAsia="宋体"/>
+              </w:rPr>
+              <w:t>161.99</w:t>
+            </w:r>
+          </w:p>
+        </w:tc>
+        <w:tc>
+          <w:tcPr>
+            <w:tcW w:type="dxa" w:w="1728"/>
+          </w:tcPr>
+          <w:p>
+            <w:r>
+              <w:rPr>
+                <w:rFonts w:ascii="Times New Roman" w:hAnsi="Times New Roman" w:eastAsia="宋体"/>
+              </w:rPr>
+              <w:t>161.99</w:t>
+            </w:r>
+          </w:p>
+        </w:tc>
+        <w:tc>
+          <w:tcPr>
+            <w:tcW w:type="dxa" w:w="1728"/>
+          </w:tcPr>
+          <w:p>
+            <w:r>
+              <w:rPr>
+                <w:rFonts w:ascii="Times New Roman" w:hAnsi="Times New Roman" w:eastAsia="宋体"/>
+              </w:rPr>
+              <w:t>A527 SoC，双千兆网口，支持 2230 NVMe SSD</w:t>
+            </w:r>
+          </w:p>
+        </w:tc>
+      </w:tr>
+      <w:tr>
+        <w:tc>
+          <w:tcPr>
+            <w:tcW w:type="dxa" w:w="1728"/>
+          </w:tcPr>
+          <w:p>
+            <w:r>
+              <w:rPr>
+                <w:rFonts w:ascii="Times New Roman" w:hAnsi="Times New Roman" w:eastAsia="宋体"/>
+              </w:rPr>
+              <w:t>Radxa Power PD 30W 电源适配器</w:t>
+            </w:r>
+          </w:p>
+        </w:tc>
+        <w:tc>
+          <w:tcPr>
+            <w:tcW w:type="dxa" w:w="1728"/>
+          </w:tcPr>
+          <w:p>
+            <w:r>
+              <w:rPr>
+                <w:rFonts w:ascii="Times New Roman" w:hAnsi="Times New Roman" w:eastAsia="宋体"/>
+              </w:rPr>
+              <w:t>1</w:t>
+            </w:r>
+          </w:p>
+        </w:tc>
+        <w:tc>
+          <w:tcPr>
+            <w:tcW w:type="dxa" w:w="1728"/>
+          </w:tcPr>
+          <w:p>
+            <w:r>
+              <w:rPr>
+                <w:rFonts w:ascii="Times New Roman" w:hAnsi="Times New Roman" w:eastAsia="宋体"/>
+              </w:rPr>
+              <w:t>6.00</w:t>
+            </w:r>
+          </w:p>
+        </w:tc>
+        <w:tc>
+          <w:tcPr>
+            <w:tcW w:type="dxa" w:w="1728"/>
+          </w:tcPr>
+          <w:p>
+            <w:r>
+              <w:rPr>
+                <w:rFonts w:ascii="Times New Roman" w:hAnsi="Times New Roman" w:eastAsia="宋体"/>
+              </w:rPr>
+              <w:t>6.00</w:t>
+            </w:r>
+          </w:p>
+        </w:tc>
+        <w:tc>
+          <w:tcPr>
+            <w:tcW w:type="dxa" w:w="1728"/>
+          </w:tcPr>
+          <w:p>
+            <w:r>
+              <w:rPr>
+                <w:rFonts w:ascii="Times New Roman" w:hAnsi="Times New Roman" w:eastAsia="宋体"/>
+              </w:rPr>
+              <w:t>官方兼容电源</w:t>
+            </w:r>
+          </w:p>
+        </w:tc>
+      </w:tr>
+      <w:tr>
+        <w:tc>
+          <w:tcPr>
+            <w:tcW w:type="dxa" w:w="1728"/>
+          </w:tcPr>
+          <w:p>
+            <w:r>
+              <w:rPr>
+                <w:rFonts w:ascii="Times New Roman" w:hAnsi="Times New Roman" w:eastAsia="宋体"/>
+              </w:rPr>
+              <w:t>合计</w:t>
+            </w:r>
+          </w:p>
+        </w:tc>
+        <w:tc>
+          <w:tcPr>
+            <w:tcW w:type="dxa" w:w="1728"/>
+          </w:tcPr>
+          <w:p>
+            <w:r>
+              <w:rPr>
+                <w:rFonts w:ascii="Times New Roman" w:hAnsi="Times New Roman" w:eastAsia="宋体"/>
+              </w:rPr>
+            </w:r>
+          </w:p>
+        </w:tc>
+        <w:tc>
+          <w:tcPr>
+            <w:tcW w:type="dxa" w:w="1728"/>
+          </w:tcPr>
+          <w:p>
+            <w:r>
+              <w:rPr>
+                <w:rFonts w:ascii="Times New Roman" w:hAnsi="Times New Roman" w:eastAsia="宋体"/>
+              </w:rPr>
+            </w:r>
+          </w:p>
+        </w:tc>
+        <w:tc>
+          <w:tcPr>
+            <w:tcW w:type="dxa" w:w="1728"/>
+          </w:tcPr>
+          <w:p>
+            <w:r>
+              <w:rPr>
+                <w:rFonts w:ascii="Times New Roman" w:hAnsi="Times New Roman" w:eastAsia="宋体"/>
+              </w:rPr>
+              <w:t>167.99</w:t>
+            </w:r>
+          </w:p>
+        </w:tc>
+        <w:tc>
+          <w:tcPr>
+            <w:tcW w:type="dxa" w:w="1728"/>
+          </w:tcPr>
+          <w:p>
+            <w:r>
+              <w:rPr>
+                <w:rFonts w:ascii="Times New Roman" w:hAnsi="Times New Roman" w:eastAsia="宋体"/>
+              </w:rPr>
+              <w:t>实际支出以下单页和发票/订单为准</w:t>
+            </w:r>
+          </w:p>
+        </w:tc>
+      </w:tr>
+    </w:tbl>
+    <w:p>
+      <w:pPr>
+        <w:pStyle w:val="Heading1"/>
+      </w:pPr>
+      <w:r>
+        <w:rPr>
+          <w:rFonts w:ascii="Times New Roman" w:hAnsi="Times New Roman" w:eastAsia="宋体"/>
+          <w:b w:val="0"/>
+        </w:rPr>
+        <w:t>三、必要性与论证</w:t>
       </w:r>
     </w:p>
     <w:p>
       <w:pPr>
-        <w:spacing w:after="60"/>
-        <w:jc w:val="center"/>
+        <w:pStyle w:val="ListBullet"/>
       </w:pPr>
+      <w:r>
+        <w:rPr>
+          <w:rFonts w:ascii="Times New Roman" w:hAnsi="Times New Roman" w:eastAsia="宋体"/>
+        </w:rPr>
+        <w:t>双千兆网口适合把雷达数据网络与上位机/实验室网络分离，提高联调稳定性。</w:t>
+      </w:r>
+    </w:p>
+    <w:p>
+      <w:pPr>
+        <w:pStyle w:val="ListBullet"/>
+      </w:pPr>
+      <w:r>
+        <w:rPr>
+          <w:rFonts w:ascii="Times New Roman" w:hAnsi="Times New Roman" w:eastAsia="宋体"/>
+        </w:rPr>
+        <w:t>M.2 2230 NVMe SSD 扩展可为连续采集提供本地高速缓存，避免只依赖 SD 卡。</w:t>
+      </w:r>
+    </w:p>
+    <w:p>
+      <w:pPr>
+        <w:pStyle w:val="ListBullet"/>
+      </w:pPr>
+      <w:r>
+        <w:rPr>
+          <w:rFonts w:ascii="Times New Roman" w:hAnsi="Times New Roman" w:eastAsia="宋体"/>
+        </w:rPr>
+        <w:t>A527 8 核 Linux 平台适合运行采集守护进程、时间戳记录、轻量质量检查和数据转发服务。</w:t>
+      </w:r>
+    </w:p>
+    <w:p>
+      <w:pPr>
+        <w:pStyle w:val="ListBullet"/>
+      </w:pPr>
+      <w:r>
+        <w:rPr>
+          <w:rFonts w:ascii="Times New Roman" w:hAnsi="Times New Roman" w:eastAsia="宋体"/>
+        </w:rPr>
+        <w:t>内置 RISC-V MCU 可用于学习采集系统中的触发、同步、低延迟控制和硬件状态监测。</w:t>
+      </w:r>
+    </w:p>
+    <w:p>
+      <w:pPr>
+        <w:pStyle w:val="ListBullet"/>
+      </w:pPr>
+      <w:r>
+        <w:rPr>
+          <w:rFonts w:ascii="Times New Roman" w:hAnsi="Times New Roman" w:eastAsia="宋体"/>
+        </w:rPr>
+        <w:t>1GB 商业级版本价格明确，预算低，适合作为实验室双网口采集计算端的入门样机。</w:t>
+      </w:r>
+    </w:p>
+    <w:p>
+      <w:pPr>
+        <w:pStyle w:val="ListBullet"/>
+      </w:pPr>
+      <w:r>
+        <w:rPr>
+          <w:rFonts w:ascii="Times New Roman" w:hAnsi="Times New Roman" w:eastAsia="宋体"/>
+        </w:rPr>
+        <w:t>PD 30W 电源作为配套供电，降低外设接入时因供电不稳造成采集中断的风险。</w:t>
+      </w:r>
+    </w:p>
+    <w:p>
+      <w:pPr>
+        <w:pStyle w:val="Heading1"/>
+      </w:pPr>
+      <w:r>
+        <w:rPr>
+          <w:rFonts w:ascii="Times New Roman" w:hAnsi="Times New Roman" w:eastAsia="宋体"/>
+          <w:b w:val="0"/>
+        </w:rPr>
+        <w:t>四、使用计划</w:t>
+      </w:r>
+    </w:p>
+    <w:p>
+      <w:pPr>
+        <w:pStyle w:val="ListNumber"/>
+      </w:pPr>
+      <w:r>
+        <w:rPr>
+          <w:rFonts w:ascii="Times New Roman" w:hAnsi="Times New Roman" w:eastAsia="宋体"/>
+        </w:rPr>
+        <w:t>完成 A5E 系统烧录、PD 供电验证和双网口网络配置。</w:t>
+      </w:r>
+    </w:p>
+    <w:p>
+      <w:pPr>
+        <w:pStyle w:val="ListNumber"/>
+      </w:pPr>
+      <w:r>
+        <w:rPr>
+          <w:rFonts w:ascii="Times New Roman" w:hAnsi="Times New Roman" w:eastAsia="宋体"/>
+        </w:rPr>
+        <w:t>验证 M.2 2230 NVMe SSD 扩展路径，建立采集缓存目录。</w:t>
+      </w:r>
+    </w:p>
+    <w:p>
+      <w:pPr>
+        <w:pStyle w:val="ListNumber"/>
+      </w:pPr>
+      <w:r>
+        <w:rPr>
+          <w:rFonts w:ascii="Times New Roman" w:hAnsi="Times New Roman" w:eastAsia="宋体"/>
+        </w:rPr>
+        <w:t>接入雷达设备网络，验证双网口隔离下的数据接收、缓存和转发。</w:t>
+      </w:r>
+    </w:p>
+    <w:p>
+      <w:pPr>
+        <w:pStyle w:val="ListNumber"/>
+      </w:pPr>
+      <w:r>
+        <w:rPr>
+          <w:rFonts w:ascii="Times New Roman" w:hAnsi="Times New Roman" w:eastAsia="宋体"/>
+        </w:rPr>
+        <w:t>接入心音/心电采集链路，验证统一时间戳和文件归档规则。</w:t>
+      </w:r>
+    </w:p>
+    <w:p>
+      <w:pPr>
+        <w:pStyle w:val="ListNumber"/>
+      </w:pPr>
+      <w:r>
+        <w:rPr>
+          <w:rFonts w:ascii="Times New Roman" w:hAnsi="Times New Roman" w:eastAsia="宋体"/>
+        </w:rPr>
+        <w:t>评估 RISC-V MCU 用于触发同步和实时状态监测的开发路径。</w:t>
+      </w:r>
+    </w:p>
+    <w:p>
+      <w:pPr>
+        <w:pStyle w:val="Heading1"/>
+      </w:pPr>
+      <w:r>
+        <w:rPr>
+          <w:rFonts w:ascii="Times New Roman" w:hAnsi="Times New Roman" w:eastAsia="宋体"/>
+          <w:b w:val="0"/>
+        </w:rPr>
+        <w:t>五、验收标准</w:t>
+      </w:r>
+    </w:p>
+    <w:p>
+      <w:pPr>
+        <w:pStyle w:val="ListBullet"/>
+      </w:pPr>
+      <w:r>
+        <w:rPr>
+          <w:rFonts w:ascii="Times New Roman" w:hAnsi="Times New Roman" w:eastAsia="宋体"/>
+        </w:rPr>
+        <w:t>A5E 能够稳定启动并完成双网口通信测试。</w:t>
+      </w:r>
+    </w:p>
+    <w:p>
+      <w:pPr>
+        <w:pStyle w:val="ListBullet"/>
+      </w:pPr>
+      <w:r>
+        <w:rPr>
+          <w:rFonts w:ascii="Times New Roman" w:hAnsi="Times New Roman" w:eastAsia="宋体"/>
+        </w:rPr>
+        <w:t>能够说明并验证雷达网络与实验室网络隔离的连接方案。</w:t>
+      </w:r>
+    </w:p>
+    <w:p>
+      <w:pPr>
+        <w:pStyle w:val="ListBullet"/>
+      </w:pPr>
+      <w:r>
+        <w:rPr>
+          <w:rFonts w:ascii="Times New Roman" w:hAnsi="Times New Roman" w:eastAsia="宋体"/>
+        </w:rPr>
+        <w:t>M.2 2230 NVMe SSD 扩展路径完成可行性验证。</w:t>
+      </w:r>
+    </w:p>
+    <w:p>
+      <w:pPr>
+        <w:pStyle w:val="ListBullet"/>
+      </w:pPr>
+      <w:r>
+        <w:rPr>
+          <w:rFonts w:ascii="Times New Roman" w:hAnsi="Times New Roman" w:eastAsia="宋体"/>
+        </w:rPr>
+        <w:t>至少完成一次雷达与心音/心电同步采集流程演练或连接验证。</w:t>
+      </w:r>
+    </w:p>
+    <w:p>
+      <w:pPr>
+        <w:pStyle w:val="ListBullet"/>
+      </w:pPr>
+      <w:r>
+        <w:rPr>
+          <w:rFonts w:ascii="Times New Roman" w:hAnsi="Times New Roman" w:eastAsia="宋体"/>
+        </w:rPr>
+        <w:t>A5E 1GB 价格截图、PD 电源价格截图、订单截图和到货照片归档完整。</w:t>
+      </w:r>
+    </w:p>
+    <w:p>
+      <w:pPr>
+        <w:pStyle w:val="Heading1"/>
+      </w:pPr>
+      <w:r>
+        <w:rPr>
+          <w:rFonts w:ascii="Times New Roman" w:hAnsi="Times New Roman" w:eastAsia="宋体"/>
+          <w:b w:val="0"/>
+        </w:rPr>
+        <w:t>六、价格与图片凭证</w:t>
+      </w:r>
+    </w:p>
+    <w:p>
+      <w:pPr>
+        <w:pStyle w:val="Heading2"/>
+      </w:pPr>
+      <w:r>
+        <w:rPr>
+          <w:rFonts w:ascii="Times New Roman" w:hAnsi="Times New Roman" w:eastAsia="宋体"/>
+          <w:b w:val="0"/>
+        </w:rPr>
+        <w:t>Radxa Cubie A5E 产品外观</w:t>
+      </w:r>
+    </w:p>
+    <w:p>
       <w:r>
         <w:drawing>
           <wp:inline xmlns:a="http://schemas.openxmlformats.org/drawingml/2006/main" xmlns:pic="http://schemas.openxmlformats.org/drawingml/2006/picture">
-            <wp:extent cx="3780000" cy="1839600"/>
+            <wp:extent cx="5303520" cy="2578837"/>
             <wp:docPr id="1" name="Picture 1"/>
             <wp:cNvGraphicFramePr>
               <a:graphicFrameLocks noChangeAspect="1"/>
@@ -62,7 +582,7 @@
               <a:graphicData uri="http://schemas.openxmlformats.org/drawingml/2006/picture">
                 <pic:pic>
                   <pic:nvPicPr>
-                    <pic:cNvPr id="0" name="radxa-cubie-a5e-view.png"/>
+                    <pic:cNvPr id="0" name="radxa-cubie-a5e-view.docx.png"/>
                     <pic:cNvPicPr/>
                   </pic:nvPicPr>
                   <pic:blipFill>
@@ -74,7 +594,7 @@
                   <pic:spPr>
                     <a:xfrm>
                       <a:off x="0" y="0"/>
-                      <a:ext cx="3780000" cy="1839600"/>
+                      <a:ext cx="5303520" cy="2578837"/>
                     </a:xfrm>
                     <a:prstGeom prst="rect"/>
                   </pic:spPr>
@@ -87,28 +607,21 @@
     </w:p>
     <w:p>
       <w:pPr>
-        <w:spacing w:after="160"/>
-        <w:jc w:val="center"/>
+        <w:pStyle w:val="Heading2"/>
       </w:pPr>
       <w:r>
         <w:rPr>
-          <w:rFonts w:ascii="Microsoft YaHei" w:hAnsi="Microsoft YaHei" w:eastAsia="Microsoft YaHei"/>
+          <w:rFonts w:ascii="Times New Roman" w:hAnsi="Times New Roman" w:eastAsia="宋体"/>
           <w:b w:val="0"/>
-          <w:color w:val="666666"/>
-          <w:sz w:val="18"/>
         </w:rPr>
-        <w:t>图1 Radxa Cubie A5E 计算终端外观</w:t>
+        <w:t>Radxa Cubie A5E 接口标注</w:t>
       </w:r>
     </w:p>
     <w:p>
-      <w:pPr>
-        <w:spacing w:after="60"/>
-        <w:jc w:val="center"/>
-      </w:pPr>
       <w:r>
         <w:drawing>
           <wp:inline xmlns:a="http://schemas.openxmlformats.org/drawingml/2006/main" xmlns:pic="http://schemas.openxmlformats.org/drawingml/2006/picture">
-            <wp:extent cx="4824000" cy="2297653"/>
+            <wp:extent cx="5303520" cy="2525801"/>
             <wp:docPr id="2" name="Picture 2"/>
             <wp:cNvGraphicFramePr>
               <a:graphicFrameLocks noChangeAspect="1"/>
@@ -117,7 +630,7 @@
               <a:graphicData uri="http://schemas.openxmlformats.org/drawingml/2006/picture">
                 <pic:pic>
                   <pic:nvPicPr>
-                    <pic:cNvPr id="0" name="radxa-cubie-a5e-interface.png"/>
+                    <pic:cNvPr id="0" name="radxa-cubie-a5e-interface.docx.png"/>
                     <pic:cNvPicPr/>
                   </pic:nvPicPr>
                   <pic:blipFill>
@@ -129,7 +642,7 @@
                   <pic:spPr>
                     <a:xfrm>
                       <a:off x="0" y="0"/>
-                      <a:ext cx="4824000" cy="2297653"/>
+                      <a:ext cx="5303520" cy="2525801"/>
                     </a:xfrm>
                     <a:prstGeom prst="rect"/>
                   </pic:spPr>
@@ -142,28 +655,21 @@
     </w:p>
     <w:p>
       <w:pPr>
-        <w:spacing w:after="160"/>
-        <w:jc w:val="center"/>
+        <w:pStyle w:val="Heading2"/>
       </w:pPr>
       <w:r>
         <w:rPr>
-          <w:rFonts w:ascii="Microsoft YaHei" w:hAnsi="Microsoft YaHei" w:eastAsia="Microsoft YaHei"/>
+          <w:rFonts w:ascii="Times New Roman" w:hAnsi="Times New Roman" w:eastAsia="宋体"/>
           <w:b w:val="0"/>
-          <w:color w:val="666666"/>
-          <w:sz w:val="18"/>
         </w:rPr>
-        <w:t>图2 双网口、M.2、GPIO 等接口布局</w:t>
+        <w:t>A5E 1GB 商业级淘宝价格截图</w:t>
       </w:r>
     </w:p>
     <w:p>
-      <w:pPr>
-        <w:spacing w:after="60"/>
-        <w:jc w:val="center"/>
-      </w:pPr>
       <w:r>
         <w:drawing>
           <wp:inline xmlns:a="http://schemas.openxmlformats.org/drawingml/2006/main" xmlns:pic="http://schemas.openxmlformats.org/drawingml/2006/picture">
-            <wp:extent cx="2664000" cy="1500117"/>
+            <wp:extent cx="5303520" cy="2883789"/>
             <wp:docPr id="3" name="Picture 3"/>
             <wp:cNvGraphicFramePr>
               <a:graphicFrameLocks noChangeAspect="1"/>
@@ -172,7 +678,7 @@
               <a:graphicData uri="http://schemas.openxmlformats.org/drawingml/2006/picture">
                 <pic:pic>
                   <pic:nvPicPr>
-                    <pic:cNvPr id="0" name="radxa-power-pd30w.png"/>
+                    <pic:cNvPr id="0" name="taobao-a5e-1gb-price.png"/>
                     <pic:cNvPicPr/>
                   </pic:nvPicPr>
                   <pic:blipFill>
@@ -184,7 +690,7 @@
                   <pic:spPr>
                     <a:xfrm>
                       <a:off x="0" y="0"/>
-                      <a:ext cx="2664000" cy="1500117"/>
+                      <a:ext cx="5303520" cy="2883789"/>
                     </a:xfrm>
                     <a:prstGeom prst="rect"/>
                   </pic:spPr>
@@ -197,828 +703,81 @@
     </w:p>
     <w:p>
       <w:pPr>
-        <w:spacing w:after="160"/>
-        <w:jc w:val="center"/>
+        <w:pStyle w:val="Heading2"/>
       </w:pPr>
       <w:r>
         <w:rPr>
-          <w:rFonts w:ascii="Microsoft YaHei" w:hAnsi="Microsoft YaHei" w:eastAsia="Microsoft YaHei"/>
+          <w:rFonts w:ascii="Times New Roman" w:hAnsi="Times New Roman" w:eastAsia="宋体"/>
           <w:b w:val="0"/>
-          <w:color w:val="666666"/>
-          <w:sz w:val="18"/>
         </w:rPr>
-        <w:t>图3 Radxa Power PD 30W 官方兼容电源</w:t>
+        <w:t>Power PD 30W 淘宝价格截图</w:t>
+      </w:r>
+    </w:p>
+    <w:p>
+      <w:r>
+        <w:drawing>
+          <wp:inline xmlns:a="http://schemas.openxmlformats.org/drawingml/2006/main" xmlns:pic="http://schemas.openxmlformats.org/drawingml/2006/picture">
+            <wp:extent cx="5303520" cy="3314700"/>
+            <wp:docPr id="4" name="Picture 4"/>
+            <wp:cNvGraphicFramePr>
+              <a:graphicFrameLocks noChangeAspect="1"/>
+            </wp:cNvGraphicFramePr>
+            <a:graphic>
+              <a:graphicData uri="http://schemas.openxmlformats.org/drawingml/2006/picture">
+                <pic:pic>
+                  <pic:nvPicPr>
+                    <pic:cNvPr id="0" name="taobao-pd30w-price.png"/>
+                    <pic:cNvPicPr/>
+                  </pic:nvPicPr>
+                  <pic:blipFill>
+                    <a:blip r:embed="rId12"/>
+                    <a:stretch>
+                      <a:fillRect/>
+                    </a:stretch>
+                  </pic:blipFill>
+                  <pic:spPr>
+                    <a:xfrm>
+                      <a:off x="0" y="0"/>
+                      <a:ext cx="5303520" cy="3314700"/>
+                    </a:xfrm>
+                    <a:prstGeom prst="rect"/>
+                  </pic:spPr>
+                </pic:pic>
+              </a:graphicData>
+            </a:graphic>
+          </wp:inline>
+        </w:drawing>
       </w:r>
     </w:p>
     <w:p>
       <w:pPr>
         <w:pStyle w:val="Heading1"/>
-        <w:spacing w:before="200" w:after="100"/>
       </w:pPr>
       <w:r>
         <w:rPr>
-          <w:rFonts w:ascii="Microsoft YaHei" w:hAnsi="Microsoft YaHei" w:eastAsia="Microsoft YaHei"/>
-          <w:b/>
-          <w:color w:val="1F4E5F"/>
-          <w:sz w:val="32"/>
+          <w:rFonts w:ascii="Times New Roman" w:hAnsi="Times New Roman" w:eastAsia="宋体"/>
+          <w:b w:val="0"/>
         </w:rPr>
-        <w:t>一、申报内容</w:t>
+        <w:t>七、其他</w:t>
       </w:r>
     </w:p>
     <w:p>
-      <w:pPr>
-        <w:spacing w:after="120" w:line="283" w:lineRule="auto"/>
-      </w:pPr>
       <w:r>
         <w:rPr>
-          <w:rFonts w:ascii="Microsoft YaHei" w:hAnsi="Microsoft YaHei" w:eastAsia="Microsoft YaHei"/>
-          <w:sz w:val="21"/>
+          <w:rFonts w:ascii="Times New Roman" w:hAnsi="Times New Roman" w:eastAsia="宋体"/>
+          <w:b w:val="0"/>
         </w:rPr>
-        <w:t>拟采购 Radxa Cubie A5E 4GB 商业级计算终端 1 台，并配套 Radxa Power PD 30W 电源适配器 1 个。主板用于构建低成本、可移动、可复现的数据采集边缘节点；电源适配器用于保证主板和外设调试时的供电稳定性。</w:t>
+        <w:t>本申报材料已将采购对象、用途、价格来源、到货验收和后续记录方式合并整理。采购后将补充订单截图、发票或付款记录、到货照片和实验使用记录，便于后续复盘申报成功情况与实际成本。</w:t>
       </w:r>
     </w:p>
-    <w:p>
-      <w:pPr>
-        <w:spacing w:after="120" w:line="283" w:lineRule="auto"/>
-      </w:pPr>
-      <w:r>
-        <w:rPr>
-          <w:rFonts w:ascii="Microsoft YaHei" w:hAnsi="Microsoft YaHei" w:eastAsia="Microsoft YaHei"/>
-          <w:sz w:val="21"/>
-        </w:rPr>
-        <w:t>本次不采购摄像头模块。后续如果实验确实需要视觉记录，可单独论证独立申报，避免在本次主控平台采购中引入过高附件成本。</w:t>
-      </w:r>
-    </w:p>
-    <w:p>
-      <w:pPr>
-        <w:pStyle w:val="Heading1"/>
-        <w:spacing w:before="200" w:after="100"/>
-      </w:pPr>
-      <w:r>
-        <w:rPr>
-          <w:rFonts w:ascii="Microsoft YaHei" w:hAnsi="Microsoft YaHei" w:eastAsia="Microsoft YaHei"/>
-          <w:b/>
-          <w:color w:val="1F4E5F"/>
-          <w:sz w:val="32"/>
-        </w:rPr>
-        <w:t>二、用途和必要性</w:t>
-      </w:r>
-    </w:p>
-    <w:p>
-      <w:pPr>
-        <w:spacing w:after="120" w:line="283" w:lineRule="auto"/>
-      </w:pPr>
-      <w:r>
-        <w:rPr>
-          <w:rFonts w:ascii="Microsoft YaHei" w:hAnsi="Microsoft YaHei" w:eastAsia="Microsoft YaHei"/>
-          <w:sz w:val="21"/>
-        </w:rPr>
-        <w:t>该计算终端后续可用于雷达生命体征信号与心音、心电数据采集实验。双千兆网口可以将雷达设备网络与实验室局域网或上位机网络隔离，降低 IP 冲突、带宽争用和调试过程中的网络不确定性。</w:t>
-      </w:r>
-    </w:p>
-    <w:p>
-      <w:pPr>
-        <w:spacing w:after="120" w:line="283" w:lineRule="auto"/>
-      </w:pPr>
-      <w:r>
-        <w:rPr>
-          <w:rFonts w:ascii="Microsoft YaHei" w:hAnsi="Microsoft YaHei" w:eastAsia="Microsoft YaHei"/>
-          <w:sz w:val="21"/>
-        </w:rPr>
-        <w:t>M.2 M Key 2230 NVMe 扩展位可安装小尺寸固态硬盘，用于连续采集过程中的本地高速缓存、断网保护和离线转移。对于雷达和生理信号采集，稳定写盘和清晰的数据归档比单纯依赖上位机实时接收更可靠。</w:t>
-      </w:r>
-    </w:p>
-    <w:p>
-      <w:pPr>
-        <w:spacing w:after="120" w:line="283" w:lineRule="auto"/>
-      </w:pPr>
-      <w:r>
-        <w:rPr>
-          <w:rFonts w:ascii="Microsoft YaHei" w:hAnsi="Microsoft YaHei" w:eastAsia="Microsoft YaHei"/>
-          <w:sz w:val="21"/>
-        </w:rPr>
-        <w:t>Cubie A5E 的新颖架构在于 Linux 主系统之外内置独立 RISC-V MCU，可运行 RTOS。Linux 侧负责网络、文件、脚本调度和上位机通信；RISC-V MCU 侧可承担触发、同步、状态监测和低延迟控制。这种“数据处理 + 实时控制”分层架构值得学习，也适合作为后续实验室采集设备原型。</w:t>
-      </w:r>
-    </w:p>
-    <w:p>
-      <w:pPr>
-        <w:pStyle w:val="Heading1"/>
-        <w:spacing w:before="200" w:after="100"/>
-      </w:pPr>
-      <w:r>
-        <w:rPr>
-          <w:rFonts w:ascii="Microsoft YaHei" w:hAnsi="Microsoft YaHei" w:eastAsia="Microsoft YaHei"/>
-          <w:b/>
-          <w:color w:val="1F4E5F"/>
-          <w:sz w:val="32"/>
-        </w:rPr>
-        <w:t>三、预算和价格说明</w:t>
-      </w:r>
-    </w:p>
-    <w:tbl>
-      <w:tblPr>
-        <w:tblStyle w:val="TableGrid"/>
-        <w:tblW w:type="dxa" w:w="11200"/>
-        <w:tblLook w:firstColumn="1" w:firstRow="1" w:lastColumn="0" w:lastRow="0" w:noHBand="0" w:noVBand="1" w:val="04A0"/>
-      </w:tblPr>
-      <w:tblGrid>
-        <w:gridCol w:w="3000"/>
-        <w:gridCol w:w="850"/>
-        <w:gridCol w:w="1300"/>
-        <w:gridCol w:w="1350"/>
-        <w:gridCol w:w="4700"/>
-      </w:tblGrid>
-      <w:tr>
-        <w:tc>
-          <w:tcPr>
-            <w:tcW w:type="dxa" w:w="3000"/>
-            <w:vAlign w:val="center"/>
-            <w:shd w:fill="EAF4F2"/>
-          </w:tcPr>
-          <w:p>
-            <w:pPr>
-              <w:spacing w:after="40"/>
-            </w:pPr>
-            <w:r>
-              <w:rPr>
-                <w:rFonts w:ascii="Microsoft YaHei" w:hAnsi="Microsoft YaHei" w:eastAsia="Microsoft YaHei"/>
-                <w:b/>
-                <w:sz w:val="19"/>
-              </w:rPr>
-              <w:t>项目</w:t>
-            </w:r>
-          </w:p>
-        </w:tc>
-        <w:tc>
-          <w:tcPr>
-            <w:tcW w:type="dxa" w:w="850"/>
-            <w:vAlign w:val="center"/>
-            <w:shd w:fill="EAF4F2"/>
-          </w:tcPr>
-          <w:p>
-            <w:pPr>
-              <w:spacing w:after="40"/>
-            </w:pPr>
-            <w:r>
-              <w:rPr>
-                <w:rFonts w:ascii="Microsoft YaHei" w:hAnsi="Microsoft YaHei" w:eastAsia="Microsoft YaHei"/>
-                <w:b/>
-                <w:sz w:val="19"/>
-              </w:rPr>
-              <w:t>数量</w:t>
-            </w:r>
-          </w:p>
-        </w:tc>
-        <w:tc>
-          <w:tcPr>
-            <w:tcW w:type="dxa" w:w="1300"/>
-            <w:vAlign w:val="center"/>
-            <w:shd w:fill="EAF4F2"/>
-          </w:tcPr>
-          <w:p>
-            <w:pPr>
-              <w:spacing w:after="40"/>
-            </w:pPr>
-            <w:r>
-              <w:rPr>
-                <w:rFonts w:ascii="Microsoft YaHei" w:hAnsi="Microsoft YaHei" w:eastAsia="Microsoft YaHei"/>
-                <w:b/>
-                <w:sz w:val="19"/>
-              </w:rPr>
-              <w:t>单价(CNY)</w:t>
-            </w:r>
-          </w:p>
-        </w:tc>
-        <w:tc>
-          <w:tcPr>
-            <w:tcW w:type="dxa" w:w="1350"/>
-            <w:vAlign w:val="center"/>
-            <w:shd w:fill="EAF4F2"/>
-          </w:tcPr>
-          <w:p>
-            <w:pPr>
-              <w:spacing w:after="40"/>
-            </w:pPr>
-            <w:r>
-              <w:rPr>
-                <w:rFonts w:ascii="Microsoft YaHei" w:hAnsi="Microsoft YaHei" w:eastAsia="Microsoft YaHei"/>
-                <w:b/>
-                <w:sz w:val="19"/>
-              </w:rPr>
-              <w:t>小计(CNY)</w:t>
-            </w:r>
-          </w:p>
-        </w:tc>
-        <w:tc>
-          <w:tcPr>
-            <w:tcW w:type="dxa" w:w="4700"/>
-            <w:vAlign w:val="center"/>
-            <w:shd w:fill="EAF4F2"/>
-          </w:tcPr>
-          <w:p>
-            <w:pPr>
-              <w:spacing w:after="40"/>
-            </w:pPr>
-            <w:r>
-              <w:rPr>
-                <w:rFonts w:ascii="Microsoft YaHei" w:hAnsi="Microsoft YaHei" w:eastAsia="Microsoft YaHei"/>
-                <w:b/>
-                <w:sz w:val="19"/>
-              </w:rPr>
-              <w:t>说明</w:t>
-            </w:r>
-          </w:p>
-        </w:tc>
-      </w:tr>
-      <w:tr>
-        <w:tc>
-          <w:tcPr>
-            <w:tcW w:type="dxa" w:w="3000"/>
-            <w:vAlign w:val="center"/>
-          </w:tcPr>
-          <w:p>
-            <w:pPr>
-              <w:spacing w:after="40"/>
-            </w:pPr>
-            <w:r>
-              <w:rPr>
-                <w:rFonts w:ascii="Microsoft YaHei" w:hAnsi="Microsoft YaHei" w:eastAsia="Microsoft YaHei"/>
-                <w:b w:val="0"/>
-                <w:sz w:val="19"/>
-              </w:rPr>
-              <w:t>Radxa Cubie A5E 4GB 商业级计算终端</w:t>
-            </w:r>
-          </w:p>
-        </w:tc>
-        <w:tc>
-          <w:tcPr>
-            <w:tcW w:type="dxa" w:w="850"/>
-            <w:vAlign w:val="center"/>
-          </w:tcPr>
-          <w:p>
-            <w:pPr>
-              <w:spacing w:after="40"/>
-            </w:pPr>
-            <w:r>
-              <w:rPr>
-                <w:rFonts w:ascii="Microsoft YaHei" w:hAnsi="Microsoft YaHei" w:eastAsia="Microsoft YaHei"/>
-                <w:b w:val="0"/>
-                <w:sz w:val="19"/>
-              </w:rPr>
-              <w:t>1</w:t>
-            </w:r>
-          </w:p>
-        </w:tc>
-        <w:tc>
-          <w:tcPr>
-            <w:tcW w:type="dxa" w:w="1300"/>
-            <w:vAlign w:val="center"/>
-          </w:tcPr>
-          <w:p>
-            <w:pPr>
-              <w:spacing w:after="40"/>
-            </w:pPr>
-            <w:r>
-              <w:rPr>
-                <w:rFonts w:ascii="Microsoft YaHei" w:hAnsi="Microsoft YaHei" w:eastAsia="Microsoft YaHei"/>
-                <w:b w:val="0"/>
-                <w:sz w:val="19"/>
-              </w:rPr>
-              <w:t>待复核</w:t>
-            </w:r>
-          </w:p>
-        </w:tc>
-        <w:tc>
-          <w:tcPr>
-            <w:tcW w:type="dxa" w:w="1350"/>
-            <w:vAlign w:val="center"/>
-          </w:tcPr>
-          <w:p>
-            <w:pPr>
-              <w:spacing w:after="40"/>
-            </w:pPr>
-            <w:r>
-              <w:rPr>
-                <w:rFonts w:ascii="Microsoft YaHei" w:hAnsi="Microsoft YaHei" w:eastAsia="Microsoft YaHei"/>
-                <w:b w:val="0"/>
-                <w:sz w:val="19"/>
-              </w:rPr>
-              <w:t>待复核</w:t>
-            </w:r>
-          </w:p>
-        </w:tc>
-        <w:tc>
-          <w:tcPr>
-            <w:tcW w:type="dxa" w:w="4700"/>
-            <w:vAlign w:val="center"/>
-          </w:tcPr>
-          <w:p>
-            <w:pPr>
-              <w:spacing w:after="40"/>
-            </w:pPr>
-            <w:r>
-              <w:rPr>
-                <w:rFonts w:ascii="Microsoft YaHei" w:hAnsi="Microsoft YaHei" w:eastAsia="Microsoft YaHei"/>
-                <w:b w:val="0"/>
-                <w:sz w:val="19"/>
-              </w:rPr>
-              <w:t>当前淘宝页面 ¥161.99 为 1GB 商业级起售价，4GB 金额以下单规格页为准</w:t>
-            </w:r>
-          </w:p>
-        </w:tc>
-      </w:tr>
-      <w:tr>
-        <w:tc>
-          <w:tcPr>
-            <w:tcW w:type="dxa" w:w="3000"/>
-            <w:vAlign w:val="center"/>
-          </w:tcPr>
-          <w:p>
-            <w:pPr>
-              <w:spacing w:after="40"/>
-            </w:pPr>
-            <w:r>
-              <w:rPr>
-                <w:rFonts w:ascii="Microsoft YaHei" w:hAnsi="Microsoft YaHei" w:eastAsia="Microsoft YaHei"/>
-                <w:b w:val="0"/>
-                <w:sz w:val="19"/>
-              </w:rPr>
-              <w:t>Radxa Power PD 30W 电源适配器</w:t>
-            </w:r>
-          </w:p>
-        </w:tc>
-        <w:tc>
-          <w:tcPr>
-            <w:tcW w:type="dxa" w:w="850"/>
-            <w:vAlign w:val="center"/>
-          </w:tcPr>
-          <w:p>
-            <w:pPr>
-              <w:spacing w:after="40"/>
-            </w:pPr>
-            <w:r>
-              <w:rPr>
-                <w:rFonts w:ascii="Microsoft YaHei" w:hAnsi="Microsoft YaHei" w:eastAsia="Microsoft YaHei"/>
-                <w:b w:val="0"/>
-                <w:sz w:val="19"/>
-              </w:rPr>
-              <w:t>1</w:t>
-            </w:r>
-          </w:p>
-        </w:tc>
-        <w:tc>
-          <w:tcPr>
-            <w:tcW w:type="dxa" w:w="1300"/>
-            <w:vAlign w:val="center"/>
-          </w:tcPr>
-          <w:p>
-            <w:pPr>
-              <w:spacing w:after="40"/>
-            </w:pPr>
-            <w:r>
-              <w:rPr>
-                <w:rFonts w:ascii="Microsoft YaHei" w:hAnsi="Microsoft YaHei" w:eastAsia="Microsoft YaHei"/>
-                <w:b w:val="0"/>
-                <w:sz w:val="19"/>
-              </w:rPr>
-              <w:t>6.00</w:t>
-            </w:r>
-          </w:p>
-        </w:tc>
-        <w:tc>
-          <w:tcPr>
-            <w:tcW w:type="dxa" w:w="1350"/>
-            <w:vAlign w:val="center"/>
-          </w:tcPr>
-          <w:p>
-            <w:pPr>
-              <w:spacing w:after="40"/>
-            </w:pPr>
-            <w:r>
-              <w:rPr>
-                <w:rFonts w:ascii="Microsoft YaHei" w:hAnsi="Microsoft YaHei" w:eastAsia="Microsoft YaHei"/>
-                <w:b w:val="0"/>
-                <w:sz w:val="19"/>
-              </w:rPr>
-              <w:t>6.00</w:t>
-            </w:r>
-          </w:p>
-        </w:tc>
-        <w:tc>
-          <w:tcPr>
-            <w:tcW w:type="dxa" w:w="4700"/>
-            <w:vAlign w:val="center"/>
-          </w:tcPr>
-          <w:p>
-            <w:pPr>
-              <w:spacing w:after="40"/>
-            </w:pPr>
-            <w:r>
-              <w:rPr>
-                <w:rFonts w:ascii="Microsoft YaHei" w:hAnsi="Microsoft YaHei" w:eastAsia="Microsoft YaHei"/>
-                <w:b w:val="0"/>
-                <w:sz w:val="19"/>
-              </w:rPr>
-              <w:t>淘宝桌面版官方店搜索记录价</w:t>
-            </w:r>
-          </w:p>
-        </w:tc>
-      </w:tr>
-      <w:tr>
-        <w:tc>
-          <w:tcPr>
-            <w:tcW w:type="dxa" w:w="3000"/>
-            <w:vAlign w:val="center"/>
-          </w:tcPr>
-          <w:p>
-            <w:pPr>
-              <w:spacing w:after="40"/>
-            </w:pPr>
-            <w:r>
-              <w:rPr>
-                <w:rFonts w:ascii="Microsoft YaHei" w:hAnsi="Microsoft YaHei" w:eastAsia="Microsoft YaHei"/>
-                <w:b w:val="0"/>
-                <w:sz w:val="19"/>
-              </w:rPr>
-              <w:t>M.2 2230 NVMe SSD</w:t>
-            </w:r>
-          </w:p>
-        </w:tc>
-        <w:tc>
-          <w:tcPr>
-            <w:tcW w:type="dxa" w:w="850"/>
-            <w:vAlign w:val="center"/>
-          </w:tcPr>
-          <w:p>
-            <w:pPr>
-              <w:spacing w:after="40"/>
-            </w:pPr>
-            <w:r>
-              <w:rPr>
-                <w:rFonts w:ascii="Microsoft YaHei" w:hAnsi="Microsoft YaHei" w:eastAsia="Microsoft YaHei"/>
-                <w:b w:val="0"/>
-                <w:sz w:val="19"/>
-              </w:rPr>
-              <w:t>1</w:t>
-            </w:r>
-          </w:p>
-        </w:tc>
-        <w:tc>
-          <w:tcPr>
-            <w:tcW w:type="dxa" w:w="1300"/>
-            <w:vAlign w:val="center"/>
-          </w:tcPr>
-          <w:p>
-            <w:pPr>
-              <w:spacing w:after="40"/>
-            </w:pPr>
-            <w:r>
-              <w:rPr>
-                <w:rFonts w:ascii="Microsoft YaHei" w:hAnsi="Microsoft YaHei" w:eastAsia="Microsoft YaHei"/>
-                <w:b w:val="0"/>
-                <w:sz w:val="19"/>
-              </w:rPr>
-              <w:t>0</w:t>
-            </w:r>
-          </w:p>
-        </w:tc>
-        <w:tc>
-          <w:tcPr>
-            <w:tcW w:type="dxa" w:w="1350"/>
-            <w:vAlign w:val="center"/>
-          </w:tcPr>
-          <w:p>
-            <w:pPr>
-              <w:spacing w:after="40"/>
-            </w:pPr>
-            <w:r>
-              <w:rPr>
-                <w:rFonts w:ascii="Microsoft YaHei" w:hAnsi="Microsoft YaHei" w:eastAsia="Microsoft YaHei"/>
-                <w:b w:val="0"/>
-                <w:sz w:val="19"/>
-              </w:rPr>
-              <w:t>0</w:t>
-            </w:r>
-          </w:p>
-        </w:tc>
-        <w:tc>
-          <w:tcPr>
-            <w:tcW w:type="dxa" w:w="4700"/>
-            <w:vAlign w:val="center"/>
-          </w:tcPr>
-          <w:p>
-            <w:pPr>
-              <w:spacing w:after="40"/>
-            </w:pPr>
-            <w:r>
-              <w:rPr>
-                <w:rFonts w:ascii="Microsoft YaHei" w:hAnsi="Microsoft YaHei" w:eastAsia="Microsoft YaHei"/>
-                <w:b w:val="0"/>
-                <w:sz w:val="19"/>
-              </w:rPr>
-              <w:t>优先使用实验室库存；如需另购再单独申报</w:t>
-            </w:r>
-          </w:p>
-        </w:tc>
-      </w:tr>
-      <w:tr>
-        <w:tc>
-          <w:tcPr>
-            <w:tcW w:type="dxa" w:w="3000"/>
-            <w:vAlign w:val="center"/>
-          </w:tcPr>
-          <w:p>
-            <w:pPr>
-              <w:spacing w:after="40"/>
-            </w:pPr>
-            <w:r>
-              <w:rPr>
-                <w:rFonts w:ascii="Microsoft YaHei" w:hAnsi="Microsoft YaHei" w:eastAsia="Microsoft YaHei"/>
-                <w:b w:val="0"/>
-                <w:sz w:val="19"/>
-              </w:rPr>
-              <w:t>合计</w:t>
-            </w:r>
-          </w:p>
-        </w:tc>
-        <w:tc>
-          <w:tcPr>
-            <w:tcW w:type="dxa" w:w="850"/>
-            <w:vAlign w:val="center"/>
-          </w:tcPr>
-          <w:p>
-            <w:pPr>
-              <w:spacing w:after="40"/>
-            </w:pPr>
-            <w:r>
-              <w:rPr>
-                <w:rFonts w:ascii="Microsoft YaHei" w:hAnsi="Microsoft YaHei" w:eastAsia="Microsoft YaHei"/>
-                <w:b w:val="0"/>
-                <w:sz w:val="19"/>
-              </w:rPr>
-            </w:r>
-          </w:p>
-        </w:tc>
-        <w:tc>
-          <w:tcPr>
-            <w:tcW w:type="dxa" w:w="1300"/>
-            <w:vAlign w:val="center"/>
-          </w:tcPr>
-          <w:p>
-            <w:pPr>
-              <w:spacing w:after="40"/>
-            </w:pPr>
-            <w:r>
-              <w:rPr>
-                <w:rFonts w:ascii="Microsoft YaHei" w:hAnsi="Microsoft YaHei" w:eastAsia="Microsoft YaHei"/>
-                <w:b w:val="0"/>
-                <w:sz w:val="19"/>
-              </w:rPr>
-            </w:r>
-          </w:p>
-        </w:tc>
-        <w:tc>
-          <w:tcPr>
-            <w:tcW w:type="dxa" w:w="1350"/>
-            <w:vAlign w:val="center"/>
-          </w:tcPr>
-          <w:p>
-            <w:pPr>
-              <w:spacing w:after="40"/>
-            </w:pPr>
-            <w:r>
-              <w:rPr>
-                <w:rFonts w:ascii="Microsoft YaHei" w:hAnsi="Microsoft YaHei" w:eastAsia="Microsoft YaHei"/>
-                <w:b w:val="0"/>
-                <w:sz w:val="19"/>
-              </w:rPr>
-              <w:t>待复核 + 6.00</w:t>
-            </w:r>
-          </w:p>
-        </w:tc>
-        <w:tc>
-          <w:tcPr>
-            <w:tcW w:type="dxa" w:w="4700"/>
-            <w:vAlign w:val="center"/>
-          </w:tcPr>
-          <w:p>
-            <w:pPr>
-              <w:spacing w:after="40"/>
-            </w:pPr>
-            <w:r>
-              <w:rPr>
-                <w:rFonts w:ascii="Microsoft YaHei" w:hAnsi="Microsoft YaHei" w:eastAsia="Microsoft YaHei"/>
-                <w:b w:val="0"/>
-                <w:sz w:val="19"/>
-              </w:rPr>
-              <w:t>主板 4GB 价格复核后补齐</w:t>
-            </w:r>
-          </w:p>
-        </w:tc>
-      </w:tr>
-    </w:tbl>
-    <w:p>
-      <w:pPr>
-        <w:pStyle w:val="Heading1"/>
-        <w:spacing w:before="200" w:after="100"/>
-      </w:pPr>
-      <w:r>
-        <w:rPr>
-          <w:rFonts w:ascii="Microsoft YaHei" w:hAnsi="Microsoft YaHei" w:eastAsia="Microsoft YaHei"/>
-          <w:b/>
-          <w:color w:val="1F4E5F"/>
-          <w:sz w:val="32"/>
-        </w:rPr>
-        <w:t>四、实施计划</w:t>
-      </w:r>
-    </w:p>
-    <w:p>
-      <w:pPr>
-        <w:spacing w:after="120" w:line="283" w:lineRule="auto"/>
-      </w:pPr>
-      <w:r>
-        <w:rPr>
-          <w:rFonts w:ascii="Microsoft YaHei" w:hAnsi="Microsoft YaHei" w:eastAsia="Microsoft YaHei"/>
-          <w:sz w:val="21"/>
-        </w:rPr>
-        <w:t>完成计算终端系统烧录、PD 供电验证、网络配置与远程管理环境配置。</w:t>
-      </w:r>
-    </w:p>
-    <w:p>
-      <w:pPr>
-        <w:spacing w:after="120" w:line="283" w:lineRule="auto"/>
-      </w:pPr>
-      <w:r>
-        <w:rPr>
-          <w:rFonts w:ascii="Microsoft YaHei" w:hAnsi="Microsoft YaHei" w:eastAsia="Microsoft YaHei"/>
-          <w:sz w:val="21"/>
-        </w:rPr>
-        <w:t>安装或验证 M.2 2230 NVMe 存储，建立边缘缓存目录和数据归档规则。</w:t>
-      </w:r>
-    </w:p>
-    <w:p>
-      <w:pPr>
-        <w:spacing w:after="120" w:line="283" w:lineRule="auto"/>
-      </w:pPr>
-      <w:r>
-        <w:rPr>
-          <w:rFonts w:ascii="Microsoft YaHei" w:hAnsi="Microsoft YaHei" w:eastAsia="Microsoft YaHei"/>
-          <w:sz w:val="21"/>
-        </w:rPr>
-        <w:t>接入雷达设备网络，验证双网口隔离下的数据流接收、缓存和转发。</w:t>
-      </w:r>
-    </w:p>
-    <w:p>
-      <w:pPr>
-        <w:spacing w:after="120" w:line="283" w:lineRule="auto"/>
-      </w:pPr>
-      <w:r>
-        <w:rPr>
-          <w:rFonts w:ascii="Microsoft YaHei" w:hAnsi="Microsoft YaHei" w:eastAsia="Microsoft YaHei"/>
-          <w:sz w:val="21"/>
-        </w:rPr>
-        <w:t>接入心音/心电采集链路，验证采样时间戳记录和文件归档。</w:t>
-      </w:r>
-    </w:p>
-    <w:p>
-      <w:pPr>
-        <w:spacing w:after="120" w:line="283" w:lineRule="auto"/>
-      </w:pPr>
-      <w:r>
-        <w:rPr>
-          <w:rFonts w:ascii="Microsoft YaHei" w:hAnsi="Microsoft YaHei" w:eastAsia="Microsoft YaHei"/>
-          <w:sz w:val="21"/>
-        </w:rPr>
-        <w:t>评估 RISC-V MCU/RTOS 用于触发同步、状态监测和实时控制的开发路径。</w:t>
-      </w:r>
-    </w:p>
-    <w:p>
-      <w:pPr>
-        <w:spacing w:after="120" w:line="283" w:lineRule="auto"/>
-      </w:pPr>
-      <w:r>
-        <w:rPr>
-          <w:rFonts w:ascii="Microsoft YaHei" w:hAnsi="Microsoft YaHei" w:eastAsia="Microsoft YaHei"/>
-          <w:sz w:val="21"/>
-        </w:rPr>
-        <w:t>形成一次完整联调记录，并将采购价格、订单截图和到货照片补充到项目 README。</w:t>
-      </w:r>
-    </w:p>
-    <w:p>
-      <w:pPr>
-        <w:pStyle w:val="Heading1"/>
-        <w:spacing w:before="200" w:after="100"/>
-      </w:pPr>
-      <w:r>
-        <w:rPr>
-          <w:rFonts w:ascii="Microsoft YaHei" w:hAnsi="Microsoft YaHei" w:eastAsia="Microsoft YaHei"/>
-          <w:b/>
-          <w:color w:val="1F4E5F"/>
-          <w:sz w:val="32"/>
-        </w:rPr>
-        <w:t>五、验收标准</w:t>
-      </w:r>
-    </w:p>
-    <w:p>
-      <w:pPr>
-        <w:spacing w:after="120" w:line="283" w:lineRule="auto"/>
-      </w:pPr>
-      <w:r>
-        <w:rPr>
-          <w:rFonts w:ascii="Microsoft YaHei" w:hAnsi="Microsoft YaHei" w:eastAsia="Microsoft YaHei"/>
-          <w:sz w:val="21"/>
-        </w:rPr>
-        <w:t>计算终端能够稳定启动并完成网络连接。</w:t>
-      </w:r>
-    </w:p>
-    <w:p>
-      <w:pPr>
-        <w:spacing w:after="120" w:line="283" w:lineRule="auto"/>
-      </w:pPr>
-      <w:r>
-        <w:rPr>
-          <w:rFonts w:ascii="Microsoft YaHei" w:hAnsi="Microsoft YaHei" w:eastAsia="Microsoft YaHei"/>
-          <w:sz w:val="21"/>
-        </w:rPr>
-        <w:t>PD 30W 电源可稳定供电，采集过程中无异常断电或重启。</w:t>
-      </w:r>
-    </w:p>
-    <w:p>
-      <w:pPr>
-        <w:spacing w:after="120" w:line="283" w:lineRule="auto"/>
-      </w:pPr>
-      <w:r>
-        <w:rPr>
-          <w:rFonts w:ascii="Microsoft YaHei" w:hAnsi="Microsoft YaHei" w:eastAsia="Microsoft YaHei"/>
-          <w:sz w:val="21"/>
-        </w:rPr>
-        <w:t>至少完成一次雷达数据与心音/心电数据的同步采集流程验证。</w:t>
-      </w:r>
-    </w:p>
-    <w:p>
-      <w:pPr>
-        <w:spacing w:after="120" w:line="283" w:lineRule="auto"/>
-      </w:pPr>
-      <w:r>
-        <w:rPr>
-          <w:rFonts w:ascii="Microsoft YaHei" w:hAnsi="Microsoft YaHei" w:eastAsia="Microsoft YaHei"/>
-          <w:sz w:val="21"/>
-        </w:rPr>
-        <w:t>采集数据能够按实验编号自动归档，并验证 M.2 2230 NVMe 扩展路径可行。</w:t>
-      </w:r>
-    </w:p>
-    <w:p>
-      <w:pPr>
-        <w:spacing w:after="120" w:line="283" w:lineRule="auto"/>
-      </w:pPr>
-      <w:r>
-        <w:rPr>
-          <w:rFonts w:ascii="Microsoft YaHei" w:hAnsi="Microsoft YaHei" w:eastAsia="Microsoft YaHei"/>
-          <w:sz w:val="21"/>
-        </w:rPr>
-        <w:t>形成 RISC-V MCU/RTOS 实时控制能力的初步学习记录或验证计划。</w:t>
-      </w:r>
-    </w:p>
-    <w:p>
-      <w:pPr>
-        <w:sectPr>
-          <w:footerReference w:type="default" r:id="rId12"/>
-          <w:pgSz w:w="12240" w:h="15840"/>
-          <w:pgMar w:top="1123" w:right="1181" w:bottom="1037" w:left="1181" w:header="720" w:footer="720" w:gutter="0"/>
-          <w:cols w:space="720"/>
-          <w:docGrid w:linePitch="360"/>
-        </w:sectPr>
-      </w:pPr>
-    </w:p>
     <w:sectPr>
-      <w:type w:val="continuous"/>
       <w:pgSz w:w="12240" w:h="15840"/>
-      <w:pgMar w:top="1123" w:right="1181" w:bottom="1037" w:left="1181" w:header="720" w:footer="720" w:gutter="0"/>
+      <w:pgMar w:top="1440" w:right="1800" w:bottom="1440" w:left="1800" w:header="720" w:footer="720" w:gutter="0"/>
       <w:cols w:space="720"/>
       <w:docGrid w:linePitch="360"/>
     </w:sectPr>
   </w:body>
 </w:document>
-</file>
-
-<file path=word/footer1.xml><?xml version="1.0" encoding="utf-8"?>
-<w:ftr xmlns:m="http://schemas.openxmlformats.org/officeDocument/2006/math" xmlns:mc="http://schemas.openxmlformats.org/markup-compatibility/2006" xmlns:mo="http://schemas.microsoft.com/office/mac/office/2008/main" xmlns:mv="urn:schemas-microsoft-com:mac:vml" xmlns:o="urn:schemas-microsoft-com:office:office" xmlns:r="http://schemas.openxmlformats.org/officeDocument/2006/relationships" xmlns:v="urn:schemas-microsoft-com:vml" xmlns:w10="urn:schemas-microsoft-com:office:word" xmlns:w14="http://schemas.microsoft.com/office/word/2010/wordml" xmlns:w="http://schemas.openxmlformats.org/wordprocessingml/2006/main" xmlns:wne="http://schemas.microsoft.com/office/word/2006/wordml" xmlns:wp14="http://schemas.microsoft.com/office/word/2010/wordprocessingDrawing" xmlns:wp="http://schemas.openxmlformats.org/drawingml/2006/wordprocessingDrawing" xmlns:wpc="http://schemas.microsoft.com/office/word/2010/wordprocessingCanvas" xmlns:wpg="http://schemas.microsoft.com/office/word/2010/wordprocessingGroup" xmlns:wpi="http://schemas.microsoft.com/office/word/2010/wordprocessingInk" xmlns:wps="http://schemas.microsoft.com/office/word/2010/wordprocessingShape" mc:Ignorable="w14 wp14">
-  <w:p>
-    <w:pPr>
-      <w:pStyle w:val="Footer"/>
-      <w:jc w:val="center"/>
-    </w:pPr>
-    <w:r>
-      <w:rPr>
-        <w:rFonts w:ascii="Microsoft YaHei" w:hAnsi="Microsoft YaHei" w:eastAsia="Microsoft YaHei"/>
-        <w:b w:val="0"/>
-        <w:color w:val="777777"/>
-        <w:sz w:val="17"/>
-      </w:rPr>
-      <w:t>申报日期: 2026-05-21 | 申报状态: 待提交 | 价格说明: 4GB 主板价格待采购前复核</w:t>
-    </w:r>
-  </w:p>
-</w:ftr>
 </file>
 
 <file path=word/numbering.xml><?xml version="1.0" encoding="utf-8"?>
@@ -1385,7 +1144,7 @@
     <w:qFormat/>
     <w:rsid w:val="00FC693F"/>
     <w:rPr>
-      <w:rFonts w:ascii="Microsoft YaHei" w:hAnsi="Microsoft YaHei" w:eastAsia="Microsoft YaHei"/>
+      <w:rFonts w:ascii="Times New Roman" w:hAnsi="Times New Roman" w:eastAsia="宋体"/>
       <w:sz w:val="21"/>
     </w:rPr>
   </w:style>
@@ -1448,7 +1207,7 @@
       <w:outlineLvl w:val="0"/>
     </w:pPr>
     <w:rPr>
-      <w:rFonts w:asciiTheme="majorHAnsi" w:eastAsiaTheme="majorEastAsia" w:hAnsiTheme="majorHAnsi" w:cstheme="majorBidi"/>
+      <w:rFonts w:asciiTheme="majorHAnsi" w:eastAsiaTheme="majorEastAsia" w:hAnsiTheme="majorHAnsi" w:cstheme="majorBidi" w:ascii="Times New Roman" w:hAnsi="Times New Roman" w:eastAsia="黑体"/>
       <w:b/>
       <w:bCs/>
       <w:color w:val="365F91" w:themeColor="accent1" w:themeShade="BF"/>
@@ -1472,7 +1231,7 @@
       <w:outlineLvl w:val="1"/>
     </w:pPr>
     <w:rPr>
-      <w:rFonts w:asciiTheme="majorHAnsi" w:eastAsiaTheme="majorEastAsia" w:hAnsiTheme="majorHAnsi" w:cstheme="majorBidi"/>
+      <w:rFonts w:asciiTheme="majorHAnsi" w:eastAsiaTheme="majorEastAsia" w:hAnsiTheme="majorHAnsi" w:cstheme="majorBidi" w:ascii="Times New Roman" w:hAnsi="Times New Roman" w:eastAsia="黑体"/>
       <w:b/>
       <w:bCs/>
       <w:color w:val="4F81BD" w:themeColor="accent1"/>
@@ -1496,7 +1255,7 @@
       <w:outlineLvl w:val="2"/>
     </w:pPr>
     <w:rPr>
-      <w:rFonts w:asciiTheme="majorHAnsi" w:eastAsiaTheme="majorEastAsia" w:hAnsiTheme="majorHAnsi" w:cstheme="majorBidi"/>
+      <w:rFonts w:asciiTheme="majorHAnsi" w:eastAsiaTheme="majorEastAsia" w:hAnsiTheme="majorHAnsi" w:cstheme="majorBidi" w:ascii="Times New Roman" w:hAnsi="Times New Roman" w:eastAsia="黑体"/>
       <w:b/>
       <w:bCs/>
       <w:color w:val="4F81BD" w:themeColor="accent1"/>
@@ -1737,7 +1496,7 @@
       <w:contextualSpacing/>
     </w:pPr>
     <w:rPr>
-      <w:rFonts w:asciiTheme="majorHAnsi" w:eastAsiaTheme="majorEastAsia" w:hAnsiTheme="majorHAnsi" w:cstheme="majorBidi"/>
+      <w:rFonts w:asciiTheme="majorHAnsi" w:eastAsiaTheme="majorEastAsia" w:hAnsiTheme="majorHAnsi" w:cstheme="majorBidi" w:ascii="Times New Roman" w:hAnsi="Times New Roman" w:eastAsia="黑体"/>
       <w:color w:val="17365D" w:themeColor="text2" w:themeShade="BF"/>
       <w:spacing w:val="5"/>
       <w:kern w:val="28"/>
@@ -1820,6 +1579,10 @@
     <w:pPr>
       <w:spacing w:after="120"/>
     </w:pPr>
+    <w:rPr>
+      <w:rFonts w:ascii="Times New Roman" w:hAnsi="Times New Roman" w:eastAsia="宋体"/>
+      <w:sz w:val="21"/>
+    </w:rPr>
   </w:style>
   <w:style w:type="character" w:customStyle="1" w:styleId="BodyTextChar">
     <w:name w:val="Body Text Char"/>

</xml_diff>

<commit_message>
Refocus A5E proposal on lab outcomes
</commit_message>
<xml_diff>
--- a/applications/2026/Q2/瑞莎CubieA5E数据采集套件/申报书.docx
+++ b/applications/2026/Q2/瑞莎CubieA5E数据采集套件/申报书.docx
@@ -52,9 +52,8 @@
       <w:r>
         <w:rPr>
           <w:rFonts w:ascii="Times New Roman" w:hAnsi="Times New Roman" w:eastAsia="宋体"/>
-          <w:b w:val="0"/>
         </w:rPr>
-        <w:t>采购 Radxa Cubie A5E 1GB 商业级计算终端和 PD 供电配件，用于搭建双以太网数据采集计算端。双千兆网口用于网络隔离，M.2 2230 NVMe 扩展用于本地缓存，内置 RISC-V MCU 用于学习实时触发、同步和状态监测架构。</w:t>
+        <w:t>采购 Radxa Cubie A5E 1GB 商业级计算终端和 PD 供电配件，用于搭建双以太网数据采集计算端。双千兆网口用于网络隔离，M.2 2230 NVMe 扩展用于本地缓存，内置 RISC-V MCU 用于形成实验室可复用的实时触发、同步控制和状态监测能力。</w:t>
       </w:r>
     </w:p>
     <w:p>
@@ -488,18 +487,7 @@
         <w:rPr>
           <w:rFonts w:ascii="Times New Roman" w:hAnsi="Times New Roman" w:eastAsia="宋体"/>
         </w:rPr>
-        <w:t>验证网络隔离、本地缓存和 Linux 采集服务部署流程。</w:t>
-      </w:r>
-    </w:p>
-    <w:p>
-      <w:pPr>
-        <w:pStyle w:val="ListBullet"/>
-      </w:pPr>
-      <w:r>
-        <w:rPr>
-          <w:rFonts w:ascii="Times New Roman" w:hAnsi="Times New Roman" w:eastAsia="宋体"/>
-        </w:rPr>
-        <w:t>学习 Linux 主系统与 RISC-V MCU 分工的异构实时控制架构，为后续样机设计提供参考。</w:t>
+        <w:t>形成 Linux 主系统与 RISC-V MCU 分工的异构实时控制终端方案，为后续实验室同步采集样机设计提供可复用参考。</w:t>
       </w:r>
     </w:p>
     <w:p>

</xml_diff>

<commit_message>
Remove A5E PD evidence
</commit_message>
<xml_diff>
--- a/applications/2026/Q2/瑞莎CubieA5E数据采集套件/申报书.docx
+++ b/applications/2026/Q2/瑞莎CubieA5E数据采集套件/申报书.docx
@@ -53,7 +53,7 @@
         <w:rPr>
           <w:rFonts w:ascii="Times New Roman" w:hAnsi="Times New Roman" w:eastAsia="宋体"/>
         </w:rPr>
-        <w:t>采购 Radxa Cubie A5E 1GB 商业级计算终端和 PD 供电配件，用于搭建双以太网数据采集计算端。双千兆网口用于网络隔离，M.2 2230 NVMe 扩展用于本地缓存，内置 RISC-V MCU 用于形成实验室可复用的实时触发、同步控制和状态监测能力。</w:t>
+        <w:t>采购 Radxa Cubie A5E 1GB 商业级计算终端，用于搭建双以太网数据采集计算端。双千兆网口用于网络隔离，M.2 2230 NVMe 扩展用于本地缓存，内置 RISC-V MCU 用于形成实验室可复用的实时触发、同步控制和状态监测能力。</w:t>
       </w:r>
     </w:p>
     <w:p>
@@ -76,7 +76,7 @@
         <w:rPr>
           <w:rFonts w:ascii="Times New Roman" w:hAnsi="Times New Roman" w:eastAsia="宋体"/>
         </w:rPr>
-        <w:t>完成 A5E 系统烧录、PD 供电验证和双网口通信测试。</w:t>
+        <w:t>完成 A5E 系统烧录、供电验证和双网口通信测试。</w:t>
       </w:r>
     </w:p>
     <w:p>
@@ -306,87 +306,6 @@
                 <w:rFonts w:ascii="Times New Roman" w:hAnsi="Times New Roman" w:eastAsia="宋体"/>
                 <w:sz w:val="16"/>
               </w:rPr>
-              <w:t>Radxa Power PD 30W 电源适配器</w:t>
-            </w:r>
-          </w:p>
-        </w:tc>
-        <w:tc>
-          <w:tcPr>
-            <w:tcW w:type="dxa" w:w="1728"/>
-          </w:tcPr>
-          <w:p>
-            <w:pPr>
-              <w:jc w:val="center"/>
-            </w:pPr>
-            <w:r>
-              <w:rPr>
-                <w:rFonts w:ascii="Times New Roman" w:hAnsi="Times New Roman" w:eastAsia="宋体"/>
-                <w:sz w:val="16"/>
-              </w:rPr>
-              <w:t>1</w:t>
-            </w:r>
-          </w:p>
-        </w:tc>
-        <w:tc>
-          <w:tcPr>
-            <w:tcW w:type="dxa" w:w="1728"/>
-          </w:tcPr>
-          <w:p>
-            <w:pPr>
-              <w:jc w:val="center"/>
-            </w:pPr>
-            <w:r>
-              <w:rPr>
-                <w:rFonts w:ascii="Times New Roman" w:hAnsi="Times New Roman" w:eastAsia="宋体"/>
-                <w:sz w:val="16"/>
-              </w:rPr>
-              <w:t>6.00</w:t>
-            </w:r>
-          </w:p>
-        </w:tc>
-        <w:tc>
-          <w:tcPr>
-            <w:tcW w:type="dxa" w:w="1728"/>
-          </w:tcPr>
-          <w:p>
-            <w:pPr>
-              <w:jc w:val="center"/>
-            </w:pPr>
-            <w:r>
-              <w:rPr>
-                <w:rFonts w:ascii="Times New Roman" w:hAnsi="Times New Roman" w:eastAsia="宋体"/>
-                <w:sz w:val="16"/>
-              </w:rPr>
-              <w:t>6.00</w:t>
-            </w:r>
-          </w:p>
-        </w:tc>
-        <w:tc>
-          <w:tcPr>
-            <w:tcW w:type="dxa" w:w="1728"/>
-          </w:tcPr>
-          <w:p>
-            <w:r>
-              <w:rPr>
-                <w:rFonts w:ascii="Times New Roman" w:hAnsi="Times New Roman" w:eastAsia="宋体"/>
-                <w:sz w:val="16"/>
-              </w:rPr>
-              <w:t>官方兼容电源</w:t>
-            </w:r>
-          </w:p>
-        </w:tc>
-      </w:tr>
-      <w:tr>
-        <w:tc>
-          <w:tcPr>
-            <w:tcW w:type="dxa" w:w="1728"/>
-          </w:tcPr>
-          <w:p>
-            <w:r>
-              <w:rPr>
-                <w:rFonts w:ascii="Times New Roman" w:hAnsi="Times New Roman" w:eastAsia="宋体"/>
-                <w:sz w:val="16"/>
-              </w:rPr>
               <w:t>合计</w:t>
             </w:r>
           </w:p>
@@ -428,15 +347,12 @@
             <w:tcW w:type="dxa" w:w="1728"/>
           </w:tcPr>
           <w:p>
-            <w:pPr>
-              <w:jc w:val="center"/>
-            </w:pPr>
             <w:r>
               <w:rPr>
                 <w:rFonts w:ascii="Times New Roman" w:hAnsi="Times New Roman" w:eastAsia="宋体"/>
                 <w:sz w:val="16"/>
               </w:rPr>
-              <w:t>167.99</w:t>
+              <w:t>161.99</w:t>
             </w:r>
           </w:p>
         </w:tc>
@@ -506,9 +422,8 @@
       <w:r>
         <w:rPr>
           <w:rFonts w:ascii="Times New Roman" w:hAnsi="Times New Roman" w:eastAsia="宋体"/>
-          <w:b w:val="0"/>
         </w:rPr>
-        <w:t>价格来自淘宝桌面版截图识别和既有 PD 电源截图记录，实际支出以下单页和订单记录为准。采购后补充订单截图、到货照片、系统烧录记录和联调记录。</w:t>
+        <w:t>价格来自淘宝桌面版截图识别，实际支出以下单页和订单记录为准。采购后补充订单截图、到货照片、系统烧录记录和联调记录。</w:t>
       </w:r>
     </w:p>
     <w:p>
@@ -563,15 +478,6 @@
             </a:graphic>
           </wp:inline>
         </w:drawing>
-      </w:r>
-    </w:p>
-    <w:p>
-      <w:r>
-        <w:rPr>
-          <w:rFonts w:ascii="Times New Roman" w:hAnsi="Times New Roman" w:eastAsia="宋体"/>
-          <w:b w:val="0"/>
-        </w:rPr>
-        <w:t>Power PD 30W 淘宝价格截图</w:t>
       </w:r>
     </w:p>
     <w:p>

</xml_diff>

<commit_message>
Refine A5E proposal focus
</commit_message>
<xml_diff>
--- a/applications/2026/Q2/瑞莎CubieA5E数据采集套件/申报书.docx
+++ b/applications/2026/Q2/瑞莎CubieA5E数据采集套件/申报书.docx
@@ -12,7 +12,7 @@
           <w:b/>
           <w:sz w:val="36"/>
         </w:rPr>
-        <w:t>双网口数据采集计算终端套件采购</w:t>
+        <w:t>瑞莎 Radxa Cubie A5E 迷你主板</w:t>
       </w:r>
     </w:p>
     <w:p>
@@ -33,7 +33,7 @@
           <w:rFonts w:ascii="Times New Roman" w:hAnsi="Times New Roman" w:eastAsia="宋体"/>
           <w:b w:val="0"/>
         </w:rPr>
-        <w:t>雷达与心音、心电同步采集需要一个低成本、双网络接口的边缘 Linux 节点，用于隔离雷达数据网络和实验室局域网，同时承担数据缓存、时间戳记录和采集脚本调度。A5E 1GB 商业级版本价格明确，适合作为入门样机。</w:t>
+        <w:t>雷达与心音、心电同步采集需要一个稳定、低成本、可长期放在实验链路中的双网口数据采集终端。现有上位机直接连接多类采集设备时，容易出现雷达数据网络与实验室局域网混用、连续采集数据落盘压力大、触发同步和状态监测实时性不足等问题。因此需要一块具备双千兆网口、M.2 本地存储扩展和独立实时控制单元的 Linux 开发板，作为实验室多模态采集系统的边缘接入节点。</w:t>
       </w:r>
     </w:p>
     <w:p>
@@ -52,8 +52,9 @@
       <w:r>
         <w:rPr>
           <w:rFonts w:ascii="Times New Roman" w:hAnsi="Times New Roman" w:eastAsia="宋体"/>
+          <w:b w:val="0"/>
         </w:rPr>
-        <w:t>采购 Radxa Cubie A5E 1GB 商业级计算终端，用于搭建双以太网数据采集计算端。双千兆网口用于网络隔离，M.2 2230 NVMe 扩展用于本地缓存，内置 RISC-V MCU 用于形成实验室可复用的实时触发、同步控制和状态监测能力。</w:t>
+        <w:t>本次采购对象为瑞莎 Radxa Cubie A5E 迷你主板，选用 A527 / 1GB 商业级版本。在系统中它作为双网口数据采集终端使用：一个千兆网口连接雷达或采集设备网络，另一个千兆网口连接上位机或实验室网络；M.2 2230 NVMe SSD 插槽用于扩展本地高速缓存，承接连续采集产生的原始数据和日志；内置 RISC-V MCU 用于承担实时触发、同步控制和硬件状态监测，使 Linux 主系统与实时控制单元分工协作。</w:t>
       </w:r>
     </w:p>
     <w:p>
@@ -76,7 +77,7 @@
         <w:rPr>
           <w:rFonts w:ascii="Times New Roman" w:hAnsi="Times New Roman" w:eastAsia="宋体"/>
         </w:rPr>
-        <w:t>完成 A5E 系统烧录、供电验证和双网口通信测试。</w:t>
+        <w:t>完成 A5E 系统烧录、供电验证和双千兆网口通信测试。</w:t>
       </w:r>
     </w:p>
     <w:p>
@@ -87,7 +88,7 @@
         <w:rPr>
           <w:rFonts w:ascii="Times New Roman" w:hAnsi="Times New Roman" w:eastAsia="宋体"/>
         </w:rPr>
-        <w:t>验证雷达网络与上位机/实验室网络隔离连接方案。</w:t>
+        <w:t>建立雷达设备网络与上位机/实验室网络分离的双网口连接方案。</w:t>
       </w:r>
     </w:p>
     <w:p>
@@ -98,7 +99,7 @@
         <w:rPr>
           <w:rFonts w:ascii="Times New Roman" w:hAnsi="Times New Roman" w:eastAsia="宋体"/>
         </w:rPr>
-        <w:t>验证 M.2 2230 NVMe SSD 扩展路径和采集缓存目录。</w:t>
+        <w:t>验证 M.2 2230 NVMe SSD 插槽的本地缓存扩展路径，形成连续采集数据落盘方案。</w:t>
       </w:r>
     </w:p>
     <w:p>
@@ -109,7 +110,7 @@
         <w:rPr>
           <w:rFonts w:ascii="Times New Roman" w:hAnsi="Times New Roman" w:eastAsia="宋体"/>
         </w:rPr>
-        <w:t>评估 RISC-V MCU 用于触发同步、低延迟控制和状态监测的开发路径。</w:t>
+        <w:t>形成 RISC-V MCU 参与触发同步、低延迟控制和状态监测的终端方案。</w:t>
       </w:r>
     </w:p>
     <w:p>
@@ -225,7 +226,7 @@
                 <w:rFonts w:ascii="Times New Roman" w:hAnsi="Times New Roman" w:eastAsia="宋体"/>
                 <w:sz w:val="16"/>
               </w:rPr>
-              <w:t>Radxa Cubie A5E 1GB 商业级计算终端</w:t>
+              <w:t>Radxa Cubie A5E 1GB 商业级迷你主板</w:t>
             </w:r>
           </w:p>
         </w:tc>
@@ -288,8 +289,9 @@
             <w:r>
               <w:rPr>
                 <w:rFonts w:ascii="Times New Roman" w:hAnsi="Times New Roman" w:eastAsia="宋体"/>
+                <w:sz w:val="16"/>
               </w:rPr>
-              <w:t>当前记录价，A527 SoC，双千兆网口</w:t>
+              <w:t>A527 SoC，双千兆网口，M.2 2230 NVMe SSD 插槽，内置 RISC-V MCU</w:t>
             </w:r>
           </w:p>
         </w:tc>
@@ -346,6 +348,9 @@
             <w:tcW w:type="dxa" w:w="1728"/>
           </w:tcPr>
           <w:p>
+            <w:pPr>
+              <w:jc w:val="center"/>
+            </w:pPr>
             <w:r>
               <w:rPr>
                 <w:rFonts w:ascii="Times New Roman" w:hAnsi="Times New Roman" w:eastAsia="宋体"/>
@@ -363,6 +368,7 @@
             <w:r>
               <w:rPr>
                 <w:rFonts w:ascii="Times New Roman" w:hAnsi="Times New Roman" w:eastAsia="宋体"/>
+                <w:sz w:val="16"/>
               </w:rPr>
               <w:t>实际以审批后订单及发票为准</w:t>
             </w:r>
@@ -390,7 +396,7 @@
         <w:rPr>
           <w:rFonts w:ascii="Times New Roman" w:hAnsi="Times New Roman" w:eastAsia="宋体"/>
         </w:rPr>
-        <w:t>形成低成本双网口边缘采集计算终端，支撑雷达与心音/心电同步采集联调。</w:t>
+        <w:t>形成实验室可复用的双网口数据采集终端，支撑雷达与心音、心电同步采集联调。</w:t>
       </w:r>
     </w:p>
     <w:p>
@@ -401,7 +407,29 @@
         <w:rPr>
           <w:rFonts w:ascii="Times New Roman" w:hAnsi="Times New Roman" w:eastAsia="宋体"/>
         </w:rPr>
-        <w:t>形成 Linux 主系统与 RISC-V MCU 分工的异构实时控制终端方案，为后续实验室同步采集样机设计提供可复用参考。</w:t>
+        <w:t>形成雷达数据网络与实验室网络分离的边缘接入方案，提高多设备同步采集链路稳定性。</w:t>
+      </w:r>
+    </w:p>
+    <w:p>
+      <w:pPr>
+        <w:pStyle w:val="ListBullet"/>
+      </w:pPr>
+      <w:r>
+        <w:rPr>
+          <w:rFonts w:ascii="Times New Roman" w:hAnsi="Times New Roman" w:eastAsia="宋体"/>
+        </w:rPr>
+        <w:t>形成基于 M.2 NVMe 本地缓存的连续采集数据落盘方案，减少 SD 卡写入瓶颈。</w:t>
+      </w:r>
+    </w:p>
+    <w:p>
+      <w:pPr>
+        <w:pStyle w:val="ListBullet"/>
+      </w:pPr>
+      <w:r>
+        <w:rPr>
+          <w:rFonts w:ascii="Times New Roman" w:hAnsi="Times New Roman" w:eastAsia="宋体"/>
+        </w:rPr>
+        <w:t>形成 Linux 主系统与 RISC-V MCU 分工的实时控制终端方案，为后续实验室同步采集样机设计提供可复用参考。</w:t>
       </w:r>
     </w:p>
     <w:p>
@@ -420,8 +448,9 @@
       <w:r>
         <w:rPr>
           <w:rFonts w:ascii="Times New Roman" w:hAnsi="Times New Roman" w:eastAsia="宋体"/>
+          <w:b w:val="0"/>
         </w:rPr>
-        <w:t>本次经费按当前记录价格测算，实际采购金额以审批后订单及发票为准。</w:t>
+        <w:t>本次经费按当前记录价格测算，实际采购金额以审批后订单及发票为准。接口标注图用于说明双千兆网口、M.2 存储扩展和板载接口条件；价格截图用于说明本次选定的 A527 / 1GB 商业级版本。</w:t>
       </w:r>
     </w:p>
     <w:p>
@@ -439,14 +468,14 @@
           <w:rFonts w:ascii="Times New Roman" w:hAnsi="Times New Roman" w:eastAsia="宋体"/>
           <w:b w:val="0"/>
         </w:rPr>
-        <w:t>A5E 1GB 商业级淘宝价格截图</w:t>
+        <w:t>Radxa Cubie A5E 接口标注图</w:t>
       </w:r>
     </w:p>
     <w:p>
       <w:r>
         <w:drawing>
           <wp:inline xmlns:a="http://schemas.openxmlformats.org/drawingml/2006/main" xmlns:pic="http://schemas.openxmlformats.org/drawingml/2006/picture">
-            <wp:extent cx="5212080" cy="2834068"/>
+            <wp:extent cx="5303520" cy="2526047"/>
             <wp:docPr id="1" name="Picture 1"/>
             <wp:cNvGraphicFramePr>
               <a:graphicFrameLocks noChangeAspect="1"/>
@@ -455,7 +484,7 @@
               <a:graphicData uri="http://schemas.openxmlformats.org/drawingml/2006/picture">
                 <pic:pic>
                   <pic:nvPicPr>
-                    <pic:cNvPr id="0" name="taobao-a5e-1gb-price.png"/>
+                    <pic:cNvPr id="0" name="radxa-cubie-a5e-interface.docx.jpg"/>
                     <pic:cNvPicPr/>
                   </pic:nvPicPr>
                   <pic:blipFill>
@@ -467,7 +496,7 @@
                   <pic:spPr>
                     <a:xfrm>
                       <a:off x="0" y="0"/>
-                      <a:ext cx="5212080" cy="2834068"/>
+                      <a:ext cx="5303520" cy="2526047"/>
                     </a:xfrm>
                     <a:prstGeom prst="rect"/>
                   </pic:spPr>
@@ -480,9 +509,18 @@
     </w:p>
     <w:p>
       <w:r>
+        <w:rPr>
+          <w:rFonts w:ascii="Times New Roman" w:hAnsi="Times New Roman" w:eastAsia="宋体"/>
+          <w:b w:val="0"/>
+        </w:rPr>
+        <w:t>A5E 1GB 商业级价格截图</w:t>
+      </w:r>
+    </w:p>
+    <w:p>
+      <w:r>
         <w:drawing>
           <wp:inline xmlns:a="http://schemas.openxmlformats.org/drawingml/2006/main" xmlns:pic="http://schemas.openxmlformats.org/drawingml/2006/picture">
-            <wp:extent cx="5212080" cy="3257550"/>
+            <wp:extent cx="5303520" cy="2883789"/>
             <wp:docPr id="2" name="Picture 2"/>
             <wp:cNvGraphicFramePr>
               <a:graphicFrameLocks noChangeAspect="1"/>
@@ -491,7 +529,7 @@
               <a:graphicData uri="http://schemas.openxmlformats.org/drawingml/2006/picture">
                 <pic:pic>
                   <pic:nvPicPr>
-                    <pic:cNvPr id="0" name="taobao-pd30w-price.png"/>
+                    <pic:cNvPr id="0" name="taobao-a5e-1gb-price.png"/>
                     <pic:cNvPicPr/>
                   </pic:nvPicPr>
                   <pic:blipFill>
@@ -503,7 +541,7 @@
                   <pic:spPr>
                     <a:xfrm>
                       <a:off x="0" y="0"/>
-                      <a:ext cx="5212080" cy="3257550"/>
+                      <a:ext cx="5303520" cy="2883789"/>
                     </a:xfrm>
                     <a:prstGeom prst="rect"/>
                   </pic:spPr>

</xml_diff>